<commit_message>
docs: register revised req04 specification columns
需求文档 04 于 14:41 修订，把三个尺寸字段的源列从厘米列改为英寸列：
K(长in)->AN、M(高in)->AP、L(宽in)->AT。实现早已按英寸列编写，
本次提交使仓库内的需求文档与已验证的实现、以及 TASKS.md 中登记的
MD5 A52D5B111165F315B1B75536A0C7349A 一致。

Co-Authored-By: Claude Code <noreply@anthropic.com>
</commit_message>
<xml_diff>
--- a/文件/04/项目需求文档04.docx
+++ b/文件/04/项目需求文档04.docx
@@ -144,7 +144,7 @@
           <w:rFonts w:hint="eastAsia"/>
           <w:lang w:val="en-US" w:eastAsia="zh-CN"/>
         </w:rPr>
-        <w:t>A中excel中H列标题长(字段标题名)下的数据行数据传输到B中excel中指定的AN列标题Measure(字段标题名)下的数据行中。</w:t>
+        <w:t>A中excel中K列标题长(字段标题名)下的数据行数据传输到B中excel中指定的AN列标题Measure(字段标题名)下的数据行中。</w:t>
       </w:r>
     </w:p>
     <w:p>
@@ -160,26 +160,17 @@
           <w:rFonts w:hint="eastAsia"/>
           <w:lang w:val="en-US" w:eastAsia="zh-CN"/>
         </w:rPr>
-        <w:t>A中excel中J列标题高(字段标题名)下的数据行数据传输到B中excel中指定的AP列标题Measure(字段标题名)下的数据行中。</w:t>
-      </w:r>
-    </w:p>
-    <w:p>
-      <w:pPr>
-        <w:ind w:firstLine="420" w:firstLineChars="0"/>
-        <w:rPr>
-          <w:rFonts w:hint="eastAsia"/>
-          <w:lang w:val="en-US" w:eastAsia="zh-CN"/>
-        </w:rPr>
-      </w:pPr>
-      <w:r>
-        <w:rPr>
-          <w:rFonts w:hint="eastAsia"/>
-          <w:lang w:val="en-US" w:eastAsia="zh-CN"/>
-        </w:rPr>
-        <w:t>A中excel中E列标题重量(lb)两位小数(字段标题名)下的数据行数据传输到B中excel中指定的AR列标题Measure(字段标题名)下的数据行中。</w:t>
+        <w:t>A中excel中M列标题高(字段标题名)下的数据行数据传输到B中excel中指定的AP列标题Measure(字段标题名)下的数据</w:t>
       </w:r>
       <w:bookmarkStart w:id="0" w:name="_GoBack"/>
       <w:bookmarkEnd w:id="0"/>
+      <w:r>
+        <w:rPr>
+          <w:rFonts w:hint="eastAsia"/>
+          <w:lang w:val="en-US" w:eastAsia="zh-CN"/>
+        </w:rPr>
+        <w:t>行中。</w:t>
+      </w:r>
     </w:p>
     <w:p>
       <w:pPr>
@@ -194,7 +185,23 @@
           <w:rFonts w:hint="eastAsia"/>
           <w:lang w:val="en-US" w:eastAsia="zh-CN"/>
         </w:rPr>
-        <w:t>A中excel中I列标题宽(字段标题名)下的数据行数据传输到B中excel中指定的AT列标题Measure(字段标题名)下的数据行中。</w:t>
+        <w:t>A中excel中E列标题重量(lb)两位小数(字段标题名)下的数据行数据传输到B中excel中指定的AR列标题Measure(字段标题名)下的数据行中。</w:t>
+      </w:r>
+    </w:p>
+    <w:p>
+      <w:pPr>
+        <w:ind w:firstLine="420" w:firstLineChars="0"/>
+        <w:rPr>
+          <w:rFonts w:hint="eastAsia"/>
+          <w:lang w:val="en-US" w:eastAsia="zh-CN"/>
+        </w:rPr>
+      </w:pPr>
+      <w:r>
+        <w:rPr>
+          <w:rFonts w:hint="eastAsia"/>
+          <w:lang w:val="en-US" w:eastAsia="zh-CN"/>
+        </w:rPr>
+        <w:t>A中excel中L列标题宽(字段标题名)下的数据行数据传输到B中excel中指定的AT列标题Measure(字段标题名)下的数据行中。</w:t>
       </w:r>
     </w:p>
     <w:p>

</xml_diff>